<commit_message>
added optimisations to the collision check for critter on critter collision
</commit_message>
<xml_diff>
--- a/Game Optimisation Design Brief.docx
+++ b/Game Optimisation Design Brief.docx
@@ -10,7 +10,47 @@
         <w:t>Game Optimisation Design Brief</w:t>
       </w:r>
     </w:p>
-    <w:p/>
+    <w:p>
+      <w:pPr>
+        <w:pStyle w:val="Heading1"/>
+      </w:pPr>
+      <w:r>
+        <w:t>Design or performance update 1:</w:t>
+      </w:r>
+    </w:p>
+    <w:p/>
+    <w:p/>
+    <w:p/>
+    <w:p/>
+    <w:p/>
+    <w:p/>
+    <w:p/>
+    <w:p/>
+    <w:p/>
+    <w:p/>
+    <w:p/>
+    <w:p/>
+    <w:p/>
+    <w:p/>
+    <w:p/>
+    <w:p/>
+    <w:p/>
+    <w:p/>
+    <w:p/>
+    <w:p/>
+    <w:p/>
+    <w:p/>
+    <w:p/>
+    <w:p/>
+    <w:p>
+      <w:pPr>
+        <w:pStyle w:val="Heading1"/>
+      </w:pPr>
+      <w:r>
+        <w:lastRenderedPageBreak/>
+        <w:t>Design or performance update 2:</w:t>
+      </w:r>
+    </w:p>
     <w:sectPr>
       <w:pgSz w:w="11906" w:h="16838"/>
       <w:pgMar w:top="1440" w:right="1440" w:bottom="1440" w:left="1440" w:header="708" w:footer="708" w:gutter="0"/>

</xml_diff>

<commit_message>
worked more on the word document as well as started creating a double linked list for object pooling
</commit_message>
<xml_diff>
--- a/Game Optimisation Design Brief.docx
+++ b/Game Optimisation Design Brief.docx
@@ -15,42 +15,76 @@
         <w:pStyle w:val="Heading1"/>
       </w:pPr>
       <w:r>
-        <w:t>Design or performance update 1:</w:t>
+        <w:t xml:space="preserve">Object </w:t>
+      </w:r>
+      <w:r>
+        <w:t>pooling:</w:t>
       </w:r>
     </w:p>
-    <w:p/>
-    <w:p/>
-    <w:p/>
-    <w:p/>
-    <w:p/>
-    <w:p/>
-    <w:p/>
-    <w:p/>
-    <w:p/>
-    <w:p/>
-    <w:p/>
-    <w:p/>
-    <w:p/>
-    <w:p/>
-    <w:p/>
-    <w:p/>
-    <w:p/>
-    <w:p/>
-    <w:p/>
-    <w:p/>
-    <w:p/>
-    <w:p/>
-    <w:p/>
+    <w:p>
+      <w:r>
+        <w:t>(</w:t>
+      </w:r>
+      <w:r>
+        <w:t>Design or performance update 1</w:t>
+      </w:r>
+      <w:r>
+        <w:t>)</w:t>
+      </w:r>
+    </w:p>
+    <w:p>
+      <w:r>
+        <w:t>A performance update I have considered to add to optimise the project is to add object pooling.</w:t>
+      </w:r>
+      <w:r>
+        <w:t xml:space="preserve"> Memory fragmentation occurs more often due to frequent allocating and deallocating throughout the project, due to having to create and destroy 1000 critters in the project this can add up. Object pooling helps reduce memory fragmentation by allocating all potential objects that can be reused in a level and putting them into a pool of reuseable objects. Since object pooling uses reuseable objects, instead of repeatedly allocating and deallocating, we can instead active or deactivate objects. </w:t>
+      </w:r>
+    </w:p>
+    <w:p>
+      <w:r>
+        <w:t>The reason object pooling would help optimise the project by reducing the amount of memory used on all the created critters</w:t>
+      </w:r>
+      <w:r>
+        <w:t xml:space="preserve"> by instead of deactivating and reactivating, you could instead move al the dead critters to a deactivated object containing all the dead critters while sending dead critters to the alive critters to be reactivated.</w:t>
+      </w:r>
+    </w:p>
+    <w:p>
+      <w:r>
+        <w:t xml:space="preserve">When researching object pooling through class resources there were 3 different containers to use each with their pros and cons. The first way to implement object pooling is to use an unsorted array which benefit is that it is easy to implement but having restrictions of being slow to find objects to activate and that objects can deactivate themselves easily. A different way to implement object pooling is to use a sorted array which has the benefit of fast to iterate over activated items, and fast to activate objects, but has the downside of deactivation being manual and requires swapping data in memory. </w:t>
+      </w:r>
+      <w:r>
+        <w:t>Finally,</w:t>
+      </w:r>
+      <w:r>
+        <w:t xml:space="preserve"> a linked list could be used to implement object pooling with the advantages of being fast to activate and deactivate objects by moving them </w:t>
+      </w:r>
+      <w:r>
+        <w:t>between lists but it’s slower to iterate over linked lists compared to arrays.</w:t>
+      </w:r>
+    </w:p>
+    <w:p>
+      <w:r>
+        <w:t>I’ve decided to experiment with single or double linked lists due it being theoretically faster to activate and deactivate objects by reallocating any dead critters to a dead critter list.</w:t>
+      </w:r>
+    </w:p>
+    <w:p>
+      <w:pPr>
+        <w:pStyle w:val="Heading1"/>
+      </w:pPr>
+      <w:r>
+        <w:t>Design or performance update 2:</w:t>
+      </w:r>
+    </w:p>
     <w:p/>
     <w:p>
       <w:pPr>
         <w:pStyle w:val="Heading1"/>
       </w:pPr>
       <w:r>
-        <w:lastRenderedPageBreak/>
-        <w:t>Design or performance update 2:</w:t>
+        <w:t>Class diagram of optimisation updates</w:t>
       </w:r>
     </w:p>
+    <w:p/>
     <w:sectPr>
       <w:pgSz w:w="11906" w:h="16838"/>
       <w:pgMar w:top="1440" w:right="1440" w:bottom="1440" w:left="1440" w:header="708" w:footer="708" w:gutter="0"/>
@@ -664,7 +698,6 @@
   <w:style w:type="character" w:default="1" w:styleId="DefaultParagraphFont">
     <w:name w:val="Default Paragraph Font"/>
     <w:uiPriority w:val="1"/>
-    <w:semiHidden/>
     <w:unhideWhenUsed/>
   </w:style>
   <w:style w:type="table" w:default="1" w:styleId="TableNormal">

</xml_diff>

<commit_message>
got double linked list working just need to implement it and added columns to easily reduce collision. just need to sort my critters
</commit_message>
<xml_diff>
--- a/Game Optimisation Design Brief.docx
+++ b/Game Optimisation Design Brief.docx
@@ -72,15 +72,35 @@
         <w:pStyle w:val="Heading1"/>
       </w:pPr>
       <w:r>
-        <w:t>Design or performance update 2:</w:t>
+        <w:t>Spatial partitioning:</w:t>
+      </w:r>
+    </w:p>
+    <w:p>
+      <w:r>
+        <w:t>(</w:t>
+      </w:r>
+      <w:r>
+        <w:t>Design or performance update 2</w:t>
+      </w:r>
+      <w:r>
+        <w:t>)</w:t>
       </w:r>
     </w:p>
     <w:p/>
+    <w:p>
+      <w:r>
+        <w:t>By separating the collision to detect only critters in the same column it can greatly reduce the amount of CPU usage on running all the collisions but only detecting collision in a selected area.</w:t>
+      </w:r>
+      <w:r>
+        <w:t xml:space="preserve"> </w:t>
+      </w:r>
+    </w:p>
     <w:p>
       <w:pPr>
         <w:pStyle w:val="Heading1"/>
       </w:pPr>
       <w:r>
+        <w:lastRenderedPageBreak/>
         <w:t>Class diagram of optimisation updates</w:t>
       </w:r>
     </w:p>
@@ -698,6 +718,7 @@
   <w:style w:type="character" w:default="1" w:styleId="DefaultParagraphFont">
     <w:name w:val="Default Paragraph Font"/>
     <w:uiPriority w:val="1"/>
+    <w:semiHidden/>
     <w:unhideWhenUsed/>
   </w:style>
   <w:style w:type="table" w:default="1" w:styleId="TableNormal">

</xml_diff>

<commit_message>
got the double linked list added to the optimisations but it is causing drawing problems. will have to fix it tomorrow
</commit_message>
<xml_diff>
--- a/Game Optimisation Design Brief.docx
+++ b/Game Optimisation Design Brief.docx
@@ -89,10 +89,21 @@
     <w:p/>
     <w:p>
       <w:r>
-        <w:t>By separating the collision to detect only critters in the same column it can greatly reduce the amount of CPU usage on running all the collisions but only detecting collision in a selected area.</w:t>
-      </w:r>
-      <w:r>
-        <w:t xml:space="preserve"> </w:t>
+        <w:t xml:space="preserve">Spatial partitioning is used to sperate space in a program to two or more smaller divisions to make managing the whole space take less time in these divided sections. </w:t>
+      </w:r>
+    </w:p>
+    <w:p>
+      <w:r>
+        <w:lastRenderedPageBreak/>
+        <w:t xml:space="preserve">Spatial partitioning is to be implemented by separating the screen into a selection of columns to make collision detection be detected if critters are separated by the same columns instead of checking every critter against every other critter. </w:t>
+      </w:r>
+    </w:p>
+    <w:p>
+      <w:r>
+        <w:t>This helps reduces the amount of CPU usage by only processing collisions of critters that are in the same or neighbouring columns</w:t>
+      </w:r>
+      <w:r>
+        <w:t xml:space="preserve"> and/or rows to allow for faster run time and/or reduced memory usage by only focusing on a select grid instead of the whole screen.</w:t>
       </w:r>
     </w:p>
     <w:p>
@@ -100,7 +111,6 @@
         <w:pStyle w:val="Heading1"/>
       </w:pPr>
       <w:r>
-        <w:lastRenderedPageBreak/>
         <w:t>Class diagram of optimisation updates</w:t>
       </w:r>
     </w:p>

</xml_diff>

<commit_message>
double linked list is now finnished with the spacial grid being the next on my prioity to correct. added a test project for the second assessment task
</commit_message>
<xml_diff>
--- a/Game Optimisation Design Brief.docx
+++ b/Game Optimisation Design Brief.docx
@@ -89,21 +89,75 @@
     <w:p/>
     <w:p>
       <w:r>
-        <w:t xml:space="preserve">Spatial partitioning is used to sperate space in a program to two or more smaller divisions to make managing the whole space take less time in these divided sections. </w:t>
+        <w:t>Spatial partitioning is used to sperate space in a program to two</w:t>
+      </w:r>
+      <w:r>
+        <w:t>,</w:t>
+      </w:r>
+      <w:r>
+        <w:t xml:space="preserve"> or more smaller divisions to make managing the whole space</w:t>
+      </w:r>
+      <w:r>
+        <w:t xml:space="preserve"> to</w:t>
+      </w:r>
+      <w:r>
+        <w:t xml:space="preserve"> take less time </w:t>
+      </w:r>
+      <w:r>
+        <w:t xml:space="preserve">by, narrowing collision detection to search for those objects in the same divided areas or adjacent to those </w:t>
+      </w:r>
+      <w:r>
+        <w:lastRenderedPageBreak/>
+        <w:t xml:space="preserve">divided area to reduce the load on the CPU to move it to the GPU. </w:t>
+      </w:r>
+      <w:r>
+        <w:t xml:space="preserve"> For spatial partitioning I’ll be using a special grid</w:t>
+      </w:r>
+      <w:r>
+        <w:t xml:space="preserve">. </w:t>
       </w:r>
     </w:p>
     <w:p>
       <w:r>
-        <w:lastRenderedPageBreak/>
-        <w:t xml:space="preserve">Spatial partitioning is to be implemented by separating the screen into a selection of columns to make collision detection be detected if critters are separated by the same columns instead of checking every critter against every other critter. </w:t>
+        <w:t>A</w:t>
+      </w:r>
+      <w:r>
+        <w:t xml:space="preserve"> special grid</w:t>
+      </w:r>
+      <w:r>
+        <w:t xml:space="preserve"> </w:t>
+      </w:r>
+      <w:r>
+        <w:t xml:space="preserve">is to be implemented by separating the screen into a selection of </w:t>
+      </w:r>
+      <w:r>
+        <w:t xml:space="preserve">rows and </w:t>
+      </w:r>
+      <w:r>
+        <w:t>columns to make</w:t>
+      </w:r>
+      <w:r>
+        <w:t xml:space="preserve"> a grid. It will allow</w:t>
+      </w:r>
+      <w:r>
+        <w:t xml:space="preserve"> </w:t>
+      </w:r>
+      <w:r>
+        <w:t>the checking where the critters’ position is for collision detection to be narrowed down to only critters in the same grid or adjacent grids</w:t>
+      </w:r>
+      <w:r>
+        <w:t xml:space="preserve">. </w:t>
       </w:r>
     </w:p>
     <w:p>
       <w:r>
-        <w:t>This helps reduces the amount of CPU usage by only processing collisions of critters that are in the same or neighbouring columns</w:t>
-      </w:r>
-      <w:r>
-        <w:t xml:space="preserve"> and/or rows to allow for faster run time and/or reduced memory usage by only focusing on a select grid instead of the whole screen.</w:t>
+        <w:t xml:space="preserve">This helps reduces the amount of CPU usage by only processing collisions of critters that are in the same or neighbouring </w:t>
+      </w:r>
+      <w:r>
+        <w:t xml:space="preserve">grid </w:t>
+      </w:r>
+      <w:r>
+        <w:t>to allow for faster run time and/or reduced memory usage by only focusing on a select grid instead of the whole screen.</w:t>
       </w:r>
     </w:p>
     <w:p>
@@ -114,7 +168,54 @@
         <w:t>Class diagram of optimisation updates</w:t>
       </w:r>
     </w:p>
-    <w:p/>
+    <w:p>
+      <w:r>
+        <w:rPr>
+          <w:noProof/>
+        </w:rPr>
+        <w:drawing>
+          <wp:inline distT="0" distB="0" distL="0" distR="0" wp14:anchorId="3FD1E06A" wp14:editId="33319FAE">
+            <wp:extent cx="5731510" cy="3242310"/>
+            <wp:effectExtent l="0" t="0" r="2540" b="0"/>
+            <wp:docPr id="1997838961" name="Picture 1"/>
+            <wp:cNvGraphicFramePr>
+              <a:graphicFrameLocks xmlns:a="http://schemas.openxmlformats.org/drawingml/2006/main" noChangeAspect="1"/>
+            </wp:cNvGraphicFramePr>
+            <a:graphic xmlns:a="http://schemas.openxmlformats.org/drawingml/2006/main">
+              <a:graphicData uri="http://schemas.openxmlformats.org/drawingml/2006/picture">
+                <pic:pic xmlns:pic="http://schemas.openxmlformats.org/drawingml/2006/picture">
+                  <pic:nvPicPr>
+                    <pic:cNvPr id="1997838961" name="Picture 1997838961"/>
+                    <pic:cNvPicPr/>
+                  </pic:nvPicPr>
+                  <pic:blipFill>
+                    <a:blip r:embed="rId4">
+                      <a:extLst>
+                        <a:ext uri="{28A0092B-C50C-407E-A947-70E740481C1C}">
+                          <a14:useLocalDpi xmlns:a14="http://schemas.microsoft.com/office/drawing/2010/main" val="0"/>
+                        </a:ext>
+                      </a:extLst>
+                    </a:blip>
+                    <a:stretch>
+                      <a:fillRect/>
+                    </a:stretch>
+                  </pic:blipFill>
+                  <pic:spPr>
+                    <a:xfrm>
+                      <a:off x="0" y="0"/>
+                      <a:ext cx="5731510" cy="3242310"/>
+                    </a:xfrm>
+                    <a:prstGeom prst="rect">
+                      <a:avLst/>
+                    </a:prstGeom>
+                  </pic:spPr>
+                </pic:pic>
+              </a:graphicData>
+            </a:graphic>
+          </wp:inline>
+        </w:drawing>
+      </w:r>
+    </w:p>
     <w:sectPr>
       <w:pgSz w:w="11906" w:h="16838"/>
       <w:pgMar w:top="1440" w:right="1440" w:bottom="1440" w:left="1440" w:header="708" w:footer="708" w:gutter="0"/>

</xml_diff>

<commit_message>
finished the optimised assessment task and now moving on to testing the optimisations
</commit_message>
<xml_diff>
--- a/Game Optimisation Design Brief.docx
+++ b/Game Optimisation Design Brief.docx
@@ -119,13 +119,7 @@
     </w:p>
     <w:p>
       <w:r>
-        <w:t>A</w:t>
-      </w:r>
-      <w:r>
-        <w:t xml:space="preserve"> special grid</w:t>
-      </w:r>
-      <w:r>
-        <w:t xml:space="preserve"> </w:t>
+        <w:t xml:space="preserve">A special grid </w:t>
       </w:r>
       <w:r>
         <w:t xml:space="preserve">is to be implemented by separating the screen into a selection of </w:t>
@@ -137,16 +131,10 @@
         <w:t>columns to make</w:t>
       </w:r>
       <w:r>
-        <w:t xml:space="preserve"> a grid. It will allow</w:t>
-      </w:r>
-      <w:r>
-        <w:t xml:space="preserve"> </w:t>
-      </w:r>
-      <w:r>
-        <w:t>the checking where the critters’ position is for collision detection to be narrowed down to only critters in the same grid or adjacent grids</w:t>
-      </w:r>
-      <w:r>
-        <w:t xml:space="preserve">. </w:t>
+        <w:t xml:space="preserve"> a grid.</w:t>
+      </w:r>
+      <w:r>
+        <w:t xml:space="preserve"> Then with the double linked list code included make cells the size of a row and column and put any critter into an array of critters based on its location</w:t>
       </w:r>
     </w:p>
     <w:p>

</xml_diff>